<commit_message>
feat: complete ecommerce sales performance analysis deliverables
- Dashboard: Power BI file and exported visualization
- Data: raw and cleaned CSV datasets
- Analysis: Jupyter notebooks
- Documentation: presentation and final report
</commit_message>
<xml_diff>
--- a/ecommerce_report.docx
+++ b/ecommerce_report.docx
@@ -5,7 +5,7 @@
     <w:p>
       <w:pPr>
         <w:spacing w:after="120"/>
-        <w:jc w:val="both"/>
+        <w:jc w:val="center"/>
         <w:rPr>
           <w:rFonts w:asciiTheme="minorHAnsi" w:hAnsiTheme="minorHAnsi" w:cstheme="minorHAnsi"/>
           <w:sz w:val="10"/>
@@ -29,7 +29,7 @@
     <w:p>
       <w:pPr>
         <w:spacing w:after="80"/>
-        <w:jc w:val="both"/>
+        <w:jc w:val="center"/>
         <w:rPr>
           <w:rFonts w:asciiTheme="minorHAnsi" w:hAnsiTheme="minorHAnsi" w:cstheme="minorHAnsi"/>
         </w:rPr>
@@ -77,7 +77,7 @@
           <w:sz w:val="20"/>
           <w:szCs w:val="20"/>
         </w:rPr>
-        <w:t xml:space="preserve"> |</w:t>
+        <w:t xml:space="preserve"> | Period: December 2010 – December 2011 | Prepared by: </w:t>
       </w:r>
       <w:r>
         <w:rPr>
@@ -86,46 +86,8 @@
           <w:sz w:val="20"/>
           <w:szCs w:val="20"/>
         </w:rPr>
-        <w:t xml:space="preserve"> Period: December 2010 – December 2011 </w:t>
-      </w:r>
-      <w:r>
-        <w:rPr>
-          <w:rFonts w:asciiTheme="minorHAnsi" w:hAnsiTheme="minorHAnsi" w:cstheme="minorHAnsi"/>
-          <w:color w:val="64748B"/>
-          <w:sz w:val="20"/>
-          <w:szCs w:val="20"/>
-        </w:rPr>
-        <w:t>|</w:t>
-      </w:r>
-      <w:r>
-        <w:rPr>
-          <w:rFonts w:asciiTheme="minorHAnsi" w:hAnsiTheme="minorHAnsi" w:cstheme="minorHAnsi"/>
-          <w:color w:val="64748B"/>
-          <w:sz w:val="20"/>
-          <w:szCs w:val="20"/>
-        </w:rPr>
-        <w:t xml:space="preserve"> Prepared by: </w:t>
-      </w:r>
-      <w:r>
-        <w:rPr>
-          <w:rFonts w:asciiTheme="minorHAnsi" w:hAnsiTheme="minorHAnsi" w:cstheme="minorHAnsi"/>
-          <w:color w:val="64748B"/>
-          <w:sz w:val="20"/>
-          <w:szCs w:val="20"/>
-        </w:rPr>
-        <w:t xml:space="preserve">Happy </w:t>
-      </w:r>
-      <w:proofErr w:type="spellStart"/>
-      <w:r>
-        <w:rPr>
-          <w:rFonts w:asciiTheme="minorHAnsi" w:hAnsiTheme="minorHAnsi" w:cstheme="minorHAnsi"/>
-          <w:color w:val="64748B"/>
-          <w:sz w:val="20"/>
-          <w:szCs w:val="20"/>
-        </w:rPr>
-        <w:t>Anwuli</w:t>
-      </w:r>
-      <w:proofErr w:type="spellEnd"/>
+        <w:t>Gogo Harrison</w:t>
+      </w:r>
     </w:p>
     <w:tbl>
       <w:tblPr>
@@ -153,12 +115,6 @@
         <w:gridCol w:w="1688"/>
       </w:tblGrid>
       <w:tr>
-        <w:tblPrEx>
-          <w:tblCellMar>
-            <w:top w:w="0" w:type="dxa"/>
-            <w:bottom w:w="0" w:type="dxa"/>
-          </w:tblCellMar>
-        </w:tblPrEx>
         <w:trPr>
           <w:trHeight w:val="534"/>
         </w:trPr>
@@ -567,13 +523,7 @@
         <w:rPr>
           <w:rFonts w:asciiTheme="minorHAnsi" w:hAnsiTheme="minorHAnsi" w:cstheme="minorHAnsi"/>
         </w:rPr>
-        <w:t xml:space="preserve"> Retail dataset, th</w:t>
-      </w:r>
-      <w:r>
-        <w:rPr>
-          <w:rFonts w:asciiTheme="minorHAnsi" w:hAnsiTheme="minorHAnsi" w:cstheme="minorHAnsi"/>
-        </w:rPr>
-        <w:t>e analysis examines revenue trends, customer segmentation, product performance, and retention dynamics.</w:t>
+        <w:t xml:space="preserve"> Retail dataset, the analysis examines revenue trends, customer segmentation, product performance, and retention dynamics.</w:t>
       </w:r>
     </w:p>
     <w:p>
@@ -588,13 +538,7 @@
         <w:rPr>
           <w:rFonts w:asciiTheme="minorHAnsi" w:hAnsiTheme="minorHAnsi" w:cstheme="minorHAnsi"/>
         </w:rPr>
-        <w:t>The business generated £8.9 million in revenue across 4,338 unique customers in 37 countries. Growth was strong throughout 2011, with a pronounced Q4 se</w:t>
-      </w:r>
-      <w:r>
-        <w:rPr>
-          <w:rFonts w:asciiTheme="minorHAnsi" w:hAnsiTheme="minorHAnsi" w:cstheme="minorHAnsi"/>
-        </w:rPr>
-        <w:t xml:space="preserve">asonal peak driven by holiday purchasing </w:t>
+        <w:t xml:space="preserve">The business generated £8.9 million in revenue across 4,338 unique customers in 37 countries. Growth was strong throughout 2011, with a pronounced Q4 seasonal peak driven by holiday purchasing </w:t>
       </w:r>
       <w:proofErr w:type="spellStart"/>
       <w:r>
@@ -608,13 +552,7 @@
         <w:rPr>
           <w:rFonts w:asciiTheme="minorHAnsi" w:hAnsiTheme="minorHAnsi" w:cstheme="minorHAnsi"/>
         </w:rPr>
-        <w:t xml:space="preserve">. Three critical strategic challenges emerge from the analysis: heavy geographic concentration (83% of revenue from the UK), low first-month customer retention (~20–25%), and a high proportion of customers </w:t>
-      </w:r>
-      <w:r>
-        <w:rPr>
-          <w:rFonts w:asciiTheme="minorHAnsi" w:hAnsiTheme="minorHAnsi" w:cstheme="minorHAnsi"/>
-        </w:rPr>
-        <w:t>who make only a single purchase.</w:t>
+        <w:t>. Three critical strategic challenges emerge from the analysis: heavy geographic concentration (83% of revenue from the UK), low first-month customer retention (~20–25%), and a high proportion of customers who make only a single purchase.</w:t>
       </w:r>
     </w:p>
     <w:p>
@@ -694,13 +632,7 @@
         <w:rPr>
           <w:rFonts w:asciiTheme="minorHAnsi" w:hAnsiTheme="minorHAnsi" w:cstheme="minorHAnsi"/>
         </w:rPr>
-        <w:t xml:space="preserve"> a widely used benchmark e-commerce dataset containing invoice-level transaction records from a UK-based online gift a</w:t>
-      </w:r>
-      <w:r>
-        <w:rPr>
-          <w:rFonts w:asciiTheme="minorHAnsi" w:hAnsiTheme="minorHAnsi" w:cstheme="minorHAnsi"/>
-        </w:rPr>
-        <w:t>nd homewares retailer.</w:t>
+        <w:t xml:space="preserve"> a widely used benchmark e-commerce dataset containing invoice-level transaction records from a UK-based online gift and homewares retailer.</w:t>
       </w:r>
     </w:p>
     <w:p>
@@ -788,13 +720,7 @@
         <w:rPr>
           <w:rFonts w:asciiTheme="minorHAnsi" w:hAnsiTheme="minorHAnsi" w:cstheme="minorHAnsi"/>
         </w:rPr>
-        <w:t>Missi</w:t>
-      </w:r>
-      <w:r>
-        <w:rPr>
-          <w:rFonts w:asciiTheme="minorHAnsi" w:hAnsiTheme="minorHAnsi" w:cstheme="minorHAnsi"/>
-        </w:rPr>
-        <w:t xml:space="preserve">ng </w:t>
+        <w:t xml:space="preserve">Missing </w:t>
       </w:r>
       <w:proofErr w:type="spellStart"/>
       <w:r>
@@ -876,13 +802,7 @@
         <w:rPr>
           <w:rFonts w:asciiTheme="minorHAnsi" w:hAnsiTheme="minorHAnsi" w:cstheme="minorHAnsi"/>
         </w:rPr>
-        <w:t xml:space="preserve">Duplicate </w:t>
-      </w:r>
-      <w:r>
-        <w:rPr>
-          <w:rFonts w:asciiTheme="minorHAnsi" w:hAnsiTheme="minorHAnsi" w:cstheme="minorHAnsi"/>
-        </w:rPr>
-        <w:t>check: No exact duplicates were found in the cleaned dataset.</w:t>
+        <w:t>Duplicate check: No exact duplicates were found in the cleaned dataset.</w:t>
       </w:r>
     </w:p>
     <w:p>
@@ -953,12 +873,6 @@
         <w:gridCol w:w="6360"/>
       </w:tblGrid>
       <w:tr>
-        <w:tblPrEx>
-          <w:tblCellMar>
-            <w:top w:w="0" w:type="dxa"/>
-            <w:bottom w:w="0" w:type="dxa"/>
-          </w:tblCellMar>
-        </w:tblPrEx>
         <w:tc>
           <w:tcPr>
             <w:tcW w:w="3000" w:type="dxa"/>
@@ -1031,12 +945,6 @@
         </w:tc>
       </w:tr>
       <w:tr>
-        <w:tblPrEx>
-          <w:tblCellMar>
-            <w:top w:w="0" w:type="dxa"/>
-            <w:bottom w:w="0" w:type="dxa"/>
-          </w:tblCellMar>
-        </w:tblPrEx>
         <w:tc>
           <w:tcPr>
             <w:tcW w:w="3000" w:type="dxa"/>
@@ -1113,12 +1021,6 @@
         </w:tc>
       </w:tr>
       <w:tr>
-        <w:tblPrEx>
-          <w:tblCellMar>
-            <w:top w:w="0" w:type="dxa"/>
-            <w:bottom w:w="0" w:type="dxa"/>
-          </w:tblCellMar>
-        </w:tblPrEx>
         <w:tc>
           <w:tcPr>
             <w:tcW w:w="3000" w:type="dxa"/>
@@ -1197,12 +1099,6 @@
         </w:tc>
       </w:tr>
       <w:tr>
-        <w:tblPrEx>
-          <w:tblCellMar>
-            <w:top w:w="0" w:type="dxa"/>
-            <w:bottom w:w="0" w:type="dxa"/>
-          </w:tblCellMar>
-        </w:tblPrEx>
         <w:tc>
           <w:tcPr>
             <w:tcW w:w="3000" w:type="dxa"/>
@@ -1273,12 +1169,6 @@
         </w:tc>
       </w:tr>
       <w:tr>
-        <w:tblPrEx>
-          <w:tblCellMar>
-            <w:top w:w="0" w:type="dxa"/>
-            <w:bottom w:w="0" w:type="dxa"/>
-          </w:tblCellMar>
-        </w:tblPrEx>
         <w:tc>
           <w:tcPr>
             <w:tcW w:w="3000" w:type="dxa"/>
@@ -1349,12 +1239,6 @@
         </w:tc>
       </w:tr>
       <w:tr>
-        <w:tblPrEx>
-          <w:tblCellMar>
-            <w:top w:w="0" w:type="dxa"/>
-            <w:bottom w:w="0" w:type="dxa"/>
-          </w:tblCellMar>
-        </w:tblPrEx>
         <w:tc>
           <w:tcPr>
             <w:tcW w:w="3000" w:type="dxa"/>
@@ -1425,12 +1309,6 @@
         </w:tc>
       </w:tr>
       <w:tr>
-        <w:tblPrEx>
-          <w:tblCellMar>
-            <w:top w:w="0" w:type="dxa"/>
-            <w:bottom w:w="0" w:type="dxa"/>
-          </w:tblCellMar>
-        </w:tblPrEx>
         <w:tc>
           <w:tcPr>
             <w:tcW w:w="3000" w:type="dxa"/>
@@ -1499,12 +1377,6 @@
         </w:tc>
       </w:tr>
       <w:tr>
-        <w:tblPrEx>
-          <w:tblCellMar>
-            <w:top w:w="0" w:type="dxa"/>
-            <w:bottom w:w="0" w:type="dxa"/>
-          </w:tblCellMar>
-        </w:tblPrEx>
         <w:tc>
           <w:tcPr>
             <w:tcW w:w="3000" w:type="dxa"/>
@@ -1575,14 +1447,6 @@
     </w:tbl>
     <w:p>
       <w:pPr>
-        <w:jc w:val="both"/>
-        <w:rPr>
-          <w:rFonts w:asciiTheme="minorHAnsi" w:hAnsiTheme="minorHAnsi" w:cstheme="minorHAnsi"/>
-        </w:rPr>
-      </w:pPr>
-    </w:p>
-    <w:p>
-      <w:pPr>
         <w:pStyle w:val="Heading1"/>
         <w:jc w:val="both"/>
         <w:rPr>
@@ -1612,31 +1476,13 @@
       </w:pPr>
       <w:r>
         <w:rPr>
-          <w:rFonts w:asciiTheme="minorHAnsi" w:hAnsiTheme="minorHAnsi" w:cstheme="minorHAnsi"/>
-          <w:sz w:val="24"/>
-          <w:szCs w:val="24"/>
-        </w:rPr>
-        <w:t>3.1 Revenue Trends</w:t>
-      </w:r>
-    </w:p>
-    <w:p>
-      <w:pPr>
-        <w:spacing w:after="160"/>
-        <w:jc w:val="both"/>
-        <w:rPr>
-          <w:rFonts w:asciiTheme="minorHAnsi" w:hAnsiTheme="minorHAnsi" w:cstheme="minorHAnsi"/>
-        </w:rPr>
-      </w:pPr>
-      <w:r>
-        <w:rPr>
-          <w:rFonts w:asciiTheme="minorHAnsi" w:hAnsiTheme="minorHAnsi" w:cstheme="minorHAnsi"/>
           <w:noProof/>
         </w:rPr>
         <w:drawing>
-          <wp:inline distT="0" distB="0" distL="0" distR="0" wp14:anchorId="19881BA2" wp14:editId="1598D625">
-            <wp:extent cx="5943600" cy="2381250"/>
+          <wp:inline distT="0" distB="0" distL="0" distR="0" wp14:anchorId="7378A607" wp14:editId="7DD65555">
+            <wp:extent cx="6400800" cy="3815715"/>
             <wp:effectExtent l="0" t="0" r="0" b="0"/>
-            <wp:docPr id="1" name="Picture 1"/>
+            <wp:docPr id="11" name="Picture 11"/>
             <wp:cNvGraphicFramePr>
               <a:graphicFrameLocks xmlns:a="http://schemas.openxmlformats.org/drawingml/2006/main" noChangeAspect="1"/>
             </wp:cNvGraphicFramePr>
@@ -1644,22 +1490,19 @@
               <a:graphicData uri="http://schemas.openxmlformats.org/drawingml/2006/picture">
                 <pic:pic xmlns:pic="http://schemas.openxmlformats.org/drawingml/2006/picture">
                   <pic:nvPicPr>
-                    <pic:cNvPr id="0" name=""/>
-                    <pic:cNvPicPr>
-                      <a:picLocks noChangeAspect="1" noChangeArrowheads="1"/>
-                    </pic:cNvPicPr>
+                    <pic:cNvPr id="1" name=""/>
+                    <pic:cNvPicPr/>
                   </pic:nvPicPr>
                   <pic:blipFill>
                     <a:blip r:embed="rId8"/>
-                    <a:srcRect/>
                     <a:stretch>
                       <a:fillRect/>
                     </a:stretch>
                   </pic:blipFill>
-                  <pic:spPr bwMode="auto">
+                  <pic:spPr>
                     <a:xfrm>
                       <a:off x="0" y="0"/>
-                      <a:ext cx="5943600" cy="2381250"/>
+                      <a:ext cx="6400800" cy="3815715"/>
                     </a:xfrm>
                     <a:prstGeom prst="rect">
                       <a:avLst/>
@@ -1674,6 +1517,163 @@
     </w:p>
     <w:p>
       <w:pPr>
+        <w:pStyle w:val="Heading2"/>
+        <w:jc w:val="both"/>
+        <w:rPr>
+          <w:rFonts w:asciiTheme="minorHAnsi" w:hAnsiTheme="minorHAnsi" w:cstheme="minorHAnsi"/>
+          <w:sz w:val="24"/>
+          <w:szCs w:val="24"/>
+        </w:rPr>
+      </w:pPr>
+      <w:r>
+        <w:rPr>
+          <w:rFonts w:asciiTheme="minorHAnsi" w:hAnsiTheme="minorHAnsi" w:cstheme="minorHAnsi"/>
+          <w:b w:val="0"/>
+          <w:bCs w:val="0"/>
+          <w:i/>
+          <w:iCs/>
+          <w:color w:val="auto"/>
+          <w:sz w:val="22"/>
+          <w:szCs w:val="22"/>
+        </w:rPr>
+        <w:t>Figure 1: E-Commerce Sales Performance Dashboard —</w:t>
+      </w:r>
+      <w:r>
+        <w:rPr>
+          <w:rFonts w:asciiTheme="minorHAnsi" w:hAnsiTheme="minorHAnsi" w:cstheme="minorHAnsi"/>
+          <w:b w:val="0"/>
+          <w:bCs w:val="0"/>
+          <w:color w:val="auto"/>
+          <w:sz w:val="22"/>
+          <w:szCs w:val="22"/>
+        </w:rPr>
+        <w:t xml:space="preserve"> interactive version available via Power BI Service.</w:t>
+      </w:r>
+      <w:r>
+        <w:rPr>
+          <w:rFonts w:asciiTheme="minorHAnsi" w:hAnsiTheme="minorHAnsi" w:cstheme="minorHAnsi"/>
+          <w:b w:val="0"/>
+          <w:bCs w:val="0"/>
+          <w:color w:val="auto"/>
+          <w:sz w:val="22"/>
+          <w:szCs w:val="22"/>
+        </w:rPr>
+        <w:t xml:space="preserve"> </w:t>
+      </w:r>
+      <w:r>
+        <w:rPr>
+          <w:rFonts w:asciiTheme="minorHAnsi" w:hAnsiTheme="minorHAnsi" w:cstheme="minorHAnsi"/>
+          <w:b w:val="0"/>
+          <w:bCs w:val="0"/>
+          <w:color w:val="auto"/>
+          <w:sz w:val="22"/>
+          <w:szCs w:val="22"/>
+        </w:rPr>
+        <w:t xml:space="preserve">The dashboard supports dynamic filtering by Year, Country, Customer Segment, and Quarter, with all titles and KPIs updating in real time based on slicer selections. Key highlights include </w:t>
+      </w:r>
+      <w:r>
+        <w:rPr>
+          <w:rFonts w:asciiTheme="minorHAnsi" w:hAnsiTheme="minorHAnsi" w:cstheme="minorHAnsi"/>
+          <w:color w:val="auto"/>
+          <w:sz w:val="22"/>
+          <w:szCs w:val="22"/>
+        </w:rPr>
+        <w:t>£8.34M</w:t>
+      </w:r>
+      <w:r>
+        <w:rPr>
+          <w:rFonts w:asciiTheme="minorHAnsi" w:hAnsiTheme="minorHAnsi" w:cstheme="minorHAnsi"/>
+          <w:b w:val="0"/>
+          <w:bCs w:val="0"/>
+          <w:color w:val="auto"/>
+          <w:sz w:val="22"/>
+          <w:szCs w:val="22"/>
+        </w:rPr>
+        <w:t xml:space="preserve"> total revenue, a November 2011 peak </w:t>
+      </w:r>
+      <w:r>
+        <w:rPr>
+          <w:rFonts w:asciiTheme="minorHAnsi" w:hAnsiTheme="minorHAnsi" w:cstheme="minorHAnsi"/>
+          <w:color w:val="auto"/>
+          <w:sz w:val="22"/>
+          <w:szCs w:val="22"/>
+        </w:rPr>
+        <w:t>of £1.16M</w:t>
+      </w:r>
+      <w:r>
+        <w:rPr>
+          <w:rFonts w:asciiTheme="minorHAnsi" w:hAnsiTheme="minorHAnsi" w:cstheme="minorHAnsi"/>
+          <w:b w:val="0"/>
+          <w:bCs w:val="0"/>
+          <w:color w:val="auto"/>
+          <w:sz w:val="22"/>
+          <w:szCs w:val="22"/>
+        </w:rPr>
+        <w:t xml:space="preserve">, Champions segment contributing </w:t>
+      </w:r>
+      <w:r>
+        <w:rPr>
+          <w:rFonts w:asciiTheme="minorHAnsi" w:hAnsiTheme="minorHAnsi" w:cstheme="minorHAnsi"/>
+          <w:color w:val="auto"/>
+          <w:sz w:val="22"/>
+          <w:szCs w:val="22"/>
+        </w:rPr>
+        <w:t>70%</w:t>
+      </w:r>
+      <w:r>
+        <w:rPr>
+          <w:rFonts w:asciiTheme="minorHAnsi" w:hAnsiTheme="minorHAnsi" w:cstheme="minorHAnsi"/>
+          <w:b w:val="0"/>
+          <w:bCs w:val="0"/>
+          <w:color w:val="auto"/>
+          <w:sz w:val="22"/>
+          <w:szCs w:val="22"/>
+        </w:rPr>
+        <w:t xml:space="preserve"> of revenue, and a </w:t>
+      </w:r>
+      <w:r>
+        <w:rPr>
+          <w:rFonts w:asciiTheme="minorHAnsi" w:hAnsiTheme="minorHAnsi" w:cstheme="minorHAnsi"/>
+          <w:color w:val="auto"/>
+          <w:sz w:val="22"/>
+          <w:szCs w:val="22"/>
+        </w:rPr>
+        <w:t>64%</w:t>
+      </w:r>
+      <w:r>
+        <w:rPr>
+          <w:rFonts w:asciiTheme="minorHAnsi" w:hAnsiTheme="minorHAnsi" w:cstheme="minorHAnsi"/>
+          <w:b w:val="0"/>
+          <w:bCs w:val="0"/>
+          <w:color w:val="auto"/>
+          <w:sz w:val="22"/>
+          <w:szCs w:val="22"/>
+        </w:rPr>
+        <w:t xml:space="preserve"> customer retention rate.</w:t>
+      </w:r>
+    </w:p>
+    <w:p>
+      <w:pPr>
+        <w:pStyle w:val="Heading2"/>
+        <w:jc w:val="both"/>
+        <w:rPr>
+          <w:rFonts w:asciiTheme="minorHAnsi" w:hAnsiTheme="minorHAnsi" w:cstheme="minorHAnsi"/>
+          <w:sz w:val="24"/>
+          <w:szCs w:val="24"/>
+        </w:rPr>
+      </w:pPr>
+      <w:r>
+        <w:rPr>
+          <w:rFonts w:asciiTheme="minorHAnsi" w:hAnsiTheme="minorHAnsi" w:cstheme="minorHAnsi"/>
+          <w:sz w:val="24"/>
+          <w:szCs w:val="24"/>
+        </w:rPr>
+        <w:lastRenderedPageBreak/>
+        <w:t>3.1 Revenue Trends</w:t>
+      </w:r>
+    </w:p>
+    <w:p>
+      <w:pPr>
         <w:spacing w:after="160"/>
         <w:jc w:val="both"/>
         <w:rPr>
@@ -1683,118 +1683,13 @@
       <w:r>
         <w:rPr>
           <w:rFonts w:asciiTheme="minorHAnsi" w:hAnsiTheme="minorHAnsi" w:cstheme="minorHAnsi"/>
-        </w:rPr>
-        <w:t xml:space="preserve">Revenue showed consistent growth across the analysis period, rising from approximately £400K per month in early 2011 to a peak of over £1.2M in November 2011. This sharp Q4 spike — consistent with holiday gifting </w:t>
-      </w:r>
-      <w:proofErr w:type="spellStart"/>
-      <w:r>
-        <w:rPr>
-          <w:rFonts w:asciiTheme="minorHAnsi" w:hAnsiTheme="minorHAnsi" w:cstheme="minorHAnsi"/>
-        </w:rPr>
-        <w:t>behaviour</w:t>
-      </w:r>
-      <w:proofErr w:type="spellEnd"/>
-      <w:r>
-        <w:rPr>
-          <w:rFonts w:asciiTheme="minorHAnsi" w:hAnsiTheme="minorHAnsi" w:cstheme="minorHAnsi"/>
-        </w:rPr>
-        <w:t xml:space="preserve"> — represents both an opportunity </w:t>
-      </w:r>
-      <w:r>
-        <w:rPr>
-          <w:rFonts w:asciiTheme="minorHAnsi" w:hAnsiTheme="minorHAnsi" w:cstheme="minorHAnsi"/>
-        </w:rPr>
-        <w:t xml:space="preserve">and a risk. The business is disproportionately dependent on a narrow </w:t>
-      </w:r>
-      <w:proofErr w:type="gramStart"/>
-      <w:r>
-        <w:rPr>
-          <w:rFonts w:asciiTheme="minorHAnsi" w:hAnsiTheme="minorHAnsi" w:cstheme="minorHAnsi"/>
-        </w:rPr>
-        <w:t>6-8 week</w:t>
-      </w:r>
-      <w:proofErr w:type="gramEnd"/>
-      <w:r>
-        <w:rPr>
-          <w:rFonts w:asciiTheme="minorHAnsi" w:hAnsiTheme="minorHAnsi" w:cstheme="minorHAnsi"/>
-        </w:rPr>
-        <w:t xml:space="preserve"> window each year.</w:t>
-      </w:r>
-    </w:p>
-    <w:p>
-      <w:pPr>
-        <w:spacing w:after="160"/>
-        <w:jc w:val="both"/>
-        <w:rPr>
-          <w:rFonts w:asciiTheme="minorHAnsi" w:hAnsiTheme="minorHAnsi" w:cstheme="minorHAnsi"/>
-        </w:rPr>
-      </w:pPr>
-    </w:p>
-    <w:p>
-      <w:pPr>
-        <w:spacing w:after="160"/>
-        <w:jc w:val="both"/>
-        <w:rPr>
-          <w:rFonts w:asciiTheme="minorHAnsi" w:hAnsiTheme="minorHAnsi" w:cstheme="minorHAnsi"/>
-        </w:rPr>
-      </w:pPr>
-    </w:p>
-    <w:p>
-      <w:pPr>
-        <w:spacing w:after="160"/>
-        <w:jc w:val="both"/>
-        <w:rPr>
-          <w:rFonts w:asciiTheme="minorHAnsi" w:hAnsiTheme="minorHAnsi" w:cstheme="minorHAnsi"/>
-        </w:rPr>
-      </w:pPr>
-    </w:p>
-    <w:p>
-      <w:pPr>
-        <w:spacing w:after="160"/>
-        <w:jc w:val="both"/>
-        <w:rPr>
-          <w:rFonts w:asciiTheme="minorHAnsi" w:hAnsiTheme="minorHAnsi" w:cstheme="minorHAnsi"/>
-        </w:rPr>
-      </w:pPr>
-    </w:p>
-    <w:p>
-      <w:pPr>
-        <w:spacing w:after="160"/>
-        <w:jc w:val="both"/>
-        <w:rPr>
-          <w:rFonts w:asciiTheme="minorHAnsi" w:hAnsiTheme="minorHAnsi" w:cstheme="minorHAnsi"/>
-          <w:b/>
-          <w:bCs/>
-        </w:rPr>
-      </w:pPr>
-      <w:r>
-        <w:rPr>
-          <w:rFonts w:asciiTheme="minorHAnsi" w:hAnsiTheme="minorHAnsi" w:cstheme="minorHAnsi"/>
-          <w:b/>
-          <w:bCs/>
-        </w:rPr>
-        <w:lastRenderedPageBreak/>
-        <w:t>Order Volume</w:t>
-      </w:r>
-    </w:p>
-    <w:p>
-      <w:pPr>
-        <w:spacing w:after="160"/>
-        <w:jc w:val="both"/>
-        <w:rPr>
-          <w:rFonts w:asciiTheme="minorHAnsi" w:hAnsiTheme="minorHAnsi" w:cstheme="minorHAnsi"/>
-        </w:rPr>
-      </w:pPr>
-      <w:r>
-        <w:rPr>
-          <w:rFonts w:asciiTheme="minorHAnsi" w:hAnsiTheme="minorHAnsi" w:cstheme="minorHAnsi"/>
           <w:noProof/>
         </w:rPr>
         <w:drawing>
-          <wp:inline distT="0" distB="0" distL="0" distR="0" wp14:anchorId="235BF713" wp14:editId="6F9B94BC">
-            <wp:extent cx="5943600" cy="2105025"/>
-            <wp:effectExtent l="0" t="0" r="0" b="6350"/>
-            <wp:docPr id="2" name="Picture 2"/>
+          <wp:inline distT="0" distB="0" distL="0" distR="0" wp14:anchorId="19881BA2" wp14:editId="1598D625">
+            <wp:extent cx="5943600" cy="2381250"/>
+            <wp:effectExtent l="0" t="0" r="0" b="0"/>
+            <wp:docPr id="1" name="Picture 1"/>
             <wp:cNvGraphicFramePr>
               <a:graphicFrameLocks xmlns:a="http://schemas.openxmlformats.org/drawingml/2006/main" noChangeAspect="1"/>
             </wp:cNvGraphicFramePr>
@@ -1817,7 +1712,7 @@
                   <pic:spPr bwMode="auto">
                     <a:xfrm>
                       <a:off x="0" y="0"/>
-                      <a:ext cx="5943600" cy="2105025"/>
+                      <a:ext cx="5943600" cy="2381250"/>
                     </a:xfrm>
                     <a:prstGeom prst="rect">
                       <a:avLst/>
@@ -1842,32 +1737,35 @@
         <w:rPr>
           <w:rFonts w:asciiTheme="minorHAnsi" w:hAnsiTheme="minorHAnsi" w:cstheme="minorHAnsi"/>
         </w:rPr>
-        <w:t>Order volume closely tracks revenue, confirming that growth is being driven by increased transaction frequency rather than just higher order values. December</w:t>
-      </w:r>
-      <w:r>
-        <w:rPr>
-          <w:rFonts w:asciiTheme="minorHAnsi" w:hAnsiTheme="minorHAnsi" w:cstheme="minorHAnsi"/>
-        </w:rPr>
-        <w:t xml:space="preserve"> 2011 data is partial (ending 9th December), so the apparent month-on-month decline is a data artefact.</w:t>
-      </w:r>
-    </w:p>
-    <w:p>
-      <w:pPr>
-        <w:pStyle w:val="Heading2"/>
-        <w:jc w:val="both"/>
-        <w:rPr>
-          <w:rFonts w:asciiTheme="minorHAnsi" w:hAnsiTheme="minorHAnsi" w:cstheme="minorHAnsi"/>
-          <w:sz w:val="24"/>
-          <w:szCs w:val="24"/>
-        </w:rPr>
-      </w:pPr>
-      <w:r>
-        <w:rPr>
-          <w:rFonts w:asciiTheme="minorHAnsi" w:hAnsiTheme="minorHAnsi" w:cstheme="minorHAnsi"/>
-          <w:sz w:val="24"/>
-          <w:szCs w:val="24"/>
-        </w:rPr>
-        <w:t>3.2 Geographic Performance</w:t>
+        <w:t xml:space="preserve">Revenue showed consistent growth across the analysis period, rising from approximately £400K per month in early 2011 to a peak of over £1.2M in November 2011. This sharp Q4 spike — consistent with holiday gifting </w:t>
+      </w:r>
+      <w:proofErr w:type="spellStart"/>
+      <w:r>
+        <w:rPr>
+          <w:rFonts w:asciiTheme="minorHAnsi" w:hAnsiTheme="minorHAnsi" w:cstheme="minorHAnsi"/>
+        </w:rPr>
+        <w:t>behaviour</w:t>
+      </w:r>
+      <w:proofErr w:type="spellEnd"/>
+      <w:r>
+        <w:rPr>
+          <w:rFonts w:asciiTheme="minorHAnsi" w:hAnsiTheme="minorHAnsi" w:cstheme="minorHAnsi"/>
+        </w:rPr>
+        <w:t xml:space="preserve"> — represents both an opportunity and a risk. The business is disproportionately dependent on a narrow </w:t>
+      </w:r>
+      <w:proofErr w:type="gramStart"/>
+      <w:r>
+        <w:rPr>
+          <w:rFonts w:asciiTheme="minorHAnsi" w:hAnsiTheme="minorHAnsi" w:cstheme="minorHAnsi"/>
+        </w:rPr>
+        <w:t>6-8 week</w:t>
+      </w:r>
+      <w:proofErr w:type="gramEnd"/>
+      <w:r>
+        <w:rPr>
+          <w:rFonts w:asciiTheme="minorHAnsi" w:hAnsiTheme="minorHAnsi" w:cstheme="minorHAnsi"/>
+        </w:rPr>
+        <w:t xml:space="preserve"> window each year.</w:t>
       </w:r>
     </w:p>
     <w:p>
@@ -1878,16 +1776,44 @@
           <w:rFonts w:asciiTheme="minorHAnsi" w:hAnsiTheme="minorHAnsi" w:cstheme="minorHAnsi"/>
         </w:rPr>
       </w:pPr>
+    </w:p>
+    <w:p>
+      <w:pPr>
+        <w:spacing w:after="160"/>
+        <w:jc w:val="both"/>
+        <w:rPr>
+          <w:rFonts w:asciiTheme="minorHAnsi" w:hAnsiTheme="minorHAnsi" w:cstheme="minorHAnsi"/>
+          <w:b/>
+          <w:bCs/>
+        </w:rPr>
+      </w:pPr>
+      <w:r>
+        <w:rPr>
+          <w:rFonts w:asciiTheme="minorHAnsi" w:hAnsiTheme="minorHAnsi" w:cstheme="minorHAnsi"/>
+          <w:b/>
+          <w:bCs/>
+        </w:rPr>
+        <w:t>Order Volume</w:t>
+      </w:r>
+    </w:p>
+    <w:p>
+      <w:pPr>
+        <w:spacing w:after="160"/>
+        <w:jc w:val="both"/>
+        <w:rPr>
+          <w:rFonts w:asciiTheme="minorHAnsi" w:hAnsiTheme="minorHAnsi" w:cstheme="minorHAnsi"/>
+        </w:rPr>
+      </w:pPr>
       <w:r>
         <w:rPr>
           <w:rFonts w:asciiTheme="minorHAnsi" w:hAnsiTheme="minorHAnsi" w:cstheme="minorHAnsi"/>
           <w:noProof/>
         </w:rPr>
         <w:drawing>
-          <wp:inline distT="0" distB="0" distL="0" distR="0" wp14:anchorId="33A85CEA" wp14:editId="5D01545F">
+          <wp:inline distT="0" distB="0" distL="0" distR="0" wp14:anchorId="235BF713" wp14:editId="6F9B94BC">
             <wp:extent cx="5943600" cy="2105025"/>
-            <wp:effectExtent l="0" t="0" r="0" b="0"/>
-            <wp:docPr id="3" name="Picture 3"/>
+            <wp:effectExtent l="0" t="0" r="0" b="6350"/>
+            <wp:docPr id="2" name="Picture 2"/>
             <wp:cNvGraphicFramePr>
               <a:graphicFrameLocks xmlns:a="http://schemas.openxmlformats.org/drawingml/2006/main" noChangeAspect="1"/>
             </wp:cNvGraphicFramePr>
@@ -1935,25 +1861,12 @@
         <w:rPr>
           <w:rFonts w:asciiTheme="minorHAnsi" w:hAnsiTheme="minorHAnsi" w:cstheme="minorHAnsi"/>
         </w:rPr>
-        <w:t>The United Kingdom accounts for 83% of total revenue — a level of geographic concentration that constitutes material strat</w:t>
-      </w:r>
-      <w:r>
-        <w:rPr>
-          <w:rFonts w:asciiTheme="minorHAnsi" w:hAnsiTheme="minorHAnsi" w:cstheme="minorHAnsi"/>
-        </w:rPr>
-        <w:t>egic risk. The Netherlands, Germany, France, EIRE (Republic of Ireland), and Australia represent the leading international markets, each generating six-figure revenues. Combined, the top five international markets represent a significant expansion opportun</w:t>
-      </w:r>
-      <w:r>
-        <w:rPr>
-          <w:rFonts w:asciiTheme="minorHAnsi" w:hAnsiTheme="minorHAnsi" w:cstheme="minorHAnsi"/>
-        </w:rPr>
-        <w:t>ity.</w:t>
+        <w:t>Order volume closely tracks revenue, confirming that growth is being driven by increased transaction frequency rather than just higher order values. December 2011 data is partial (ending 9th December), so the apparent month-on-month decline is a data artefact.</w:t>
       </w:r>
     </w:p>
     <w:p>
       <w:pPr>
         <w:pStyle w:val="Heading2"/>
-        <w:spacing w:before="0"/>
         <w:jc w:val="both"/>
         <w:rPr>
           <w:rFonts w:asciiTheme="minorHAnsi" w:hAnsiTheme="minorHAnsi" w:cstheme="minorHAnsi"/>
@@ -1965,7 +1878,6 @@
     <w:p>
       <w:pPr>
         <w:pStyle w:val="Heading2"/>
-        <w:spacing w:before="0"/>
         <w:jc w:val="both"/>
         <w:rPr>
           <w:rFonts w:asciiTheme="minorHAnsi" w:hAnsiTheme="minorHAnsi" w:cstheme="minorHAnsi"/>
@@ -1977,7 +1889,6 @@
     <w:p>
       <w:pPr>
         <w:pStyle w:val="Heading2"/>
-        <w:spacing w:before="0"/>
         <w:jc w:val="both"/>
         <w:rPr>
           <w:rFonts w:asciiTheme="minorHAnsi" w:hAnsiTheme="minorHAnsi" w:cstheme="minorHAnsi"/>
@@ -1989,7 +1900,6 @@
     <w:p>
       <w:pPr>
         <w:pStyle w:val="Heading2"/>
-        <w:spacing w:before="0"/>
         <w:jc w:val="both"/>
         <w:rPr>
           <w:rFonts w:asciiTheme="minorHAnsi" w:hAnsiTheme="minorHAnsi" w:cstheme="minorHAnsi"/>
@@ -1997,90 +1907,22 @@
           <w:szCs w:val="24"/>
         </w:rPr>
       </w:pPr>
-    </w:p>
-    <w:p>
-      <w:pPr>
-        <w:pStyle w:val="Heading2"/>
-        <w:spacing w:before="0"/>
-        <w:jc w:val="both"/>
+      <w:r>
         <w:rPr>
           <w:rFonts w:asciiTheme="minorHAnsi" w:hAnsiTheme="minorHAnsi" w:cstheme="minorHAnsi"/>
           <w:sz w:val="24"/>
           <w:szCs w:val="24"/>
         </w:rPr>
-      </w:pPr>
-    </w:p>
-    <w:p>
-      <w:pPr>
-        <w:pStyle w:val="Heading2"/>
-        <w:spacing w:before="0"/>
-        <w:jc w:val="both"/>
-        <w:rPr>
-          <w:rFonts w:asciiTheme="minorHAnsi" w:hAnsiTheme="minorHAnsi" w:cstheme="minorHAnsi"/>
-          <w:sz w:val="24"/>
-          <w:szCs w:val="24"/>
-        </w:rPr>
-      </w:pPr>
-    </w:p>
-    <w:p>
-      <w:pPr>
-        <w:pStyle w:val="Heading2"/>
-        <w:spacing w:before="0"/>
-        <w:jc w:val="both"/>
-        <w:rPr>
-          <w:rFonts w:asciiTheme="minorHAnsi" w:hAnsiTheme="minorHAnsi" w:cstheme="minorHAnsi"/>
-          <w:sz w:val="24"/>
-          <w:szCs w:val="24"/>
-        </w:rPr>
-      </w:pPr>
-      <w:r>
-        <w:rPr>
-          <w:rFonts w:asciiTheme="minorHAnsi" w:hAnsiTheme="minorHAnsi" w:cstheme="minorHAnsi"/>
-          <w:sz w:val="24"/>
-          <w:szCs w:val="24"/>
-        </w:rPr>
         <w:lastRenderedPageBreak/>
-        <w:t xml:space="preserve">3.3 Customer </w:t>
-      </w:r>
-      <w:proofErr w:type="spellStart"/>
-      <w:r>
-        <w:rPr>
-          <w:rFonts w:asciiTheme="minorHAnsi" w:hAnsiTheme="minorHAnsi" w:cstheme="minorHAnsi"/>
-          <w:sz w:val="24"/>
-          <w:szCs w:val="24"/>
-        </w:rPr>
-        <w:t>Behaviour</w:t>
-      </w:r>
-      <w:proofErr w:type="spellEnd"/>
-    </w:p>
-    <w:p>
-      <w:pPr>
-        <w:pStyle w:val="Heading2"/>
-        <w:spacing w:before="0"/>
-        <w:jc w:val="both"/>
-        <w:rPr>
-          <w:rFonts w:asciiTheme="minorHAnsi" w:hAnsiTheme="minorHAnsi" w:cstheme="minorHAnsi"/>
-          <w:sz w:val="20"/>
-          <w:szCs w:val="20"/>
-        </w:rPr>
-      </w:pPr>
-      <w:r>
-        <w:rPr>
-          <w:rFonts w:asciiTheme="minorHAnsi" w:hAnsiTheme="minorHAnsi" w:cstheme="minorHAnsi"/>
-          <w:sz w:val="22"/>
-          <w:szCs w:val="22"/>
-        </w:rPr>
-        <w:t>Average Order Value</w:t>
-      </w:r>
-    </w:p>
-    <w:p>
-      <w:pPr>
-        <w:pStyle w:val="Heading2"/>
-        <w:jc w:val="both"/>
-        <w:rPr>
-          <w:rFonts w:asciiTheme="minorHAnsi" w:hAnsiTheme="minorHAnsi" w:cstheme="minorHAnsi"/>
-          <w:sz w:val="24"/>
-          <w:szCs w:val="24"/>
+        <w:t>3.2 Geographic Performance</w:t>
+      </w:r>
+    </w:p>
+    <w:p>
+      <w:pPr>
+        <w:spacing w:after="160"/>
+        <w:jc w:val="both"/>
+        <w:rPr>
+          <w:rFonts w:asciiTheme="minorHAnsi" w:hAnsiTheme="minorHAnsi" w:cstheme="minorHAnsi"/>
         </w:rPr>
       </w:pPr>
       <w:r>
@@ -2089,10 +1931,10 @@
           <w:noProof/>
         </w:rPr>
         <w:drawing>
-          <wp:inline distT="0" distB="0" distL="0" distR="0" wp14:anchorId="392A0A23" wp14:editId="631671F4">
-            <wp:extent cx="5949950" cy="1866900"/>
+          <wp:inline distT="0" distB="0" distL="0" distR="0" wp14:anchorId="33A85CEA" wp14:editId="5D01545F">
+            <wp:extent cx="5943600" cy="2105025"/>
             <wp:effectExtent l="0" t="0" r="0" b="0"/>
-            <wp:docPr id="4" name="Picture 4"/>
+            <wp:docPr id="3" name="Picture 3"/>
             <wp:cNvGraphicFramePr>
               <a:graphicFrameLocks xmlns:a="http://schemas.openxmlformats.org/drawingml/2006/main" noChangeAspect="1"/>
             </wp:cNvGraphicFramePr>
@@ -2115,7 +1957,7 @@
                   <pic:spPr bwMode="auto">
                     <a:xfrm>
                       <a:off x="0" y="0"/>
-                      <a:ext cx="6005428" cy="1884307"/>
+                      <a:ext cx="5943600" cy="2105025"/>
                     </a:xfrm>
                     <a:prstGeom prst="rect">
                       <a:avLst/>
@@ -2140,28 +1982,7 @@
         <w:rPr>
           <w:rFonts w:asciiTheme="minorHAnsi" w:hAnsiTheme="minorHAnsi" w:cstheme="minorHAnsi"/>
         </w:rPr>
-        <w:t>The mean Average Order Value (AOV) across the period was £369, with a median of £230 — indicating a right-skewed distribution driven by a small number of very large orders. AOV elevated materially in Q4, r</w:t>
-      </w:r>
-      <w:r>
-        <w:rPr>
-          <w:rFonts w:asciiTheme="minorHAnsi" w:hAnsiTheme="minorHAnsi" w:cstheme="minorHAnsi"/>
-        </w:rPr>
-        <w:t>eflecting larger gift-driven basket sizes. This seasonal AOV uplift should be leveraged via targeted upsell and bundle promotions.</w:t>
-      </w:r>
-    </w:p>
-    <w:p>
-      <w:pPr>
-        <w:pStyle w:val="Heading3"/>
-        <w:jc w:val="both"/>
-        <w:rPr>
-          <w:rFonts w:asciiTheme="minorHAnsi" w:hAnsiTheme="minorHAnsi" w:cstheme="minorHAnsi"/>
-        </w:rPr>
-      </w:pPr>
-      <w:r>
-        <w:rPr>
-          <w:rFonts w:asciiTheme="minorHAnsi" w:hAnsiTheme="minorHAnsi" w:cstheme="minorHAnsi"/>
-        </w:rPr>
-        <w:t>Purchase Frequency</w:t>
+        <w:t>The United Kingdom accounts for 83% of total revenue — a level of geographic concentration that constitutes material strategic risk. The Netherlands, Germany, France, EIRE (Republic of Ireland), and Australia represent the leading international markets, each generating six-figure revenues. Combined, the top five international markets represent a significant expansion opportunity.</w:t>
       </w:r>
     </w:p>
     <w:p>
@@ -2172,16 +1993,77 @@
           <w:rFonts w:asciiTheme="minorHAnsi" w:hAnsiTheme="minorHAnsi" w:cstheme="minorHAnsi"/>
         </w:rPr>
       </w:pPr>
+    </w:p>
+    <w:p>
+      <w:pPr>
+        <w:pStyle w:val="Heading2"/>
+        <w:spacing w:before="0"/>
+        <w:jc w:val="both"/>
+        <w:rPr>
+          <w:rFonts w:asciiTheme="minorHAnsi" w:hAnsiTheme="minorHAnsi" w:cstheme="minorHAnsi"/>
+          <w:sz w:val="24"/>
+          <w:szCs w:val="24"/>
+        </w:rPr>
+      </w:pPr>
+      <w:r>
+        <w:rPr>
+          <w:rFonts w:asciiTheme="minorHAnsi" w:hAnsiTheme="minorHAnsi" w:cstheme="minorHAnsi"/>
+          <w:sz w:val="24"/>
+          <w:szCs w:val="24"/>
+        </w:rPr>
+        <w:t xml:space="preserve">3.3 Customer </w:t>
+      </w:r>
+      <w:proofErr w:type="spellStart"/>
+      <w:r>
+        <w:rPr>
+          <w:rFonts w:asciiTheme="minorHAnsi" w:hAnsiTheme="minorHAnsi" w:cstheme="minorHAnsi"/>
+          <w:sz w:val="24"/>
+          <w:szCs w:val="24"/>
+        </w:rPr>
+        <w:t>Behaviour</w:t>
+      </w:r>
+      <w:proofErr w:type="spellEnd"/>
+    </w:p>
+    <w:p>
+      <w:pPr>
+        <w:pStyle w:val="Heading2"/>
+        <w:spacing w:before="0"/>
+        <w:jc w:val="both"/>
+        <w:rPr>
+          <w:rFonts w:asciiTheme="minorHAnsi" w:hAnsiTheme="minorHAnsi" w:cstheme="minorHAnsi"/>
+          <w:sz w:val="20"/>
+          <w:szCs w:val="20"/>
+        </w:rPr>
+      </w:pPr>
+      <w:r>
+        <w:rPr>
+          <w:rFonts w:asciiTheme="minorHAnsi" w:hAnsiTheme="minorHAnsi" w:cstheme="minorHAnsi"/>
+          <w:sz w:val="22"/>
+          <w:szCs w:val="22"/>
+        </w:rPr>
+        <w:t>Average Order Value</w:t>
+      </w:r>
+    </w:p>
+    <w:p>
+      <w:pPr>
+        <w:pStyle w:val="Heading2"/>
+        <w:jc w:val="both"/>
+        <w:rPr>
+          <w:rFonts w:asciiTheme="minorHAnsi" w:hAnsiTheme="minorHAnsi" w:cstheme="minorHAnsi"/>
+          <w:sz w:val="24"/>
+          <w:szCs w:val="24"/>
+        </w:rPr>
+      </w:pPr>
       <w:r>
         <w:rPr>
           <w:rFonts w:asciiTheme="minorHAnsi" w:hAnsiTheme="minorHAnsi" w:cstheme="minorHAnsi"/>
           <w:noProof/>
         </w:rPr>
         <w:drawing>
-          <wp:inline distT="0" distB="0" distL="0" distR="0" wp14:anchorId="07121F27" wp14:editId="5D41C1AE">
-            <wp:extent cx="5943600" cy="2009775"/>
+          <wp:inline distT="0" distB="0" distL="0" distR="0" wp14:anchorId="392A0A23" wp14:editId="631671F4">
+            <wp:extent cx="5949950" cy="1866900"/>
             <wp:effectExtent l="0" t="0" r="0" b="0"/>
-            <wp:docPr id="5" name="Picture 5"/>
+            <wp:docPr id="4" name="Picture 4"/>
             <wp:cNvGraphicFramePr>
               <a:graphicFrameLocks xmlns:a="http://schemas.openxmlformats.org/drawingml/2006/main" noChangeAspect="1"/>
             </wp:cNvGraphicFramePr>
@@ -2204,7 +2086,7 @@
                   <pic:spPr bwMode="auto">
                     <a:xfrm>
                       <a:off x="0" y="0"/>
-                      <a:ext cx="5943600" cy="2009775"/>
+                      <a:ext cx="6005428" cy="1884307"/>
                     </a:xfrm>
                     <a:prstGeom prst="rect">
                       <a:avLst/>
@@ -2229,13 +2111,7 @@
         <w:rPr>
           <w:rFonts w:asciiTheme="minorHAnsi" w:hAnsiTheme="minorHAnsi" w:cstheme="minorHAnsi"/>
         </w:rPr>
-        <w:t xml:space="preserve">Approximately 35% of customers made only a single purchase. The median customer placed 2 orders, while </w:t>
-      </w:r>
-      <w:r>
-        <w:rPr>
-          <w:rFonts w:asciiTheme="minorHAnsi" w:hAnsiTheme="minorHAnsi" w:cstheme="minorHAnsi"/>
-        </w:rPr>
-        <w:t>the most active customer placed 209 orders. This frequency distribution highlights a significant opportunity in first-to-second purchase conversion — moving the modal customer from one-time to repeat buyer.</w:t>
+        <w:t>The mean Average Order Value (AOV) across the period was £369, with a median of £230 — indicating a right-skewed distribution driven by a small number of very large orders. AOV elevated materially in Q4, reflecting larger gift-driven basket sizes. This seasonal AOV uplift should be leveraged via targeted upsell and bundle promotions.</w:t>
       </w:r>
     </w:p>
     <w:p>
@@ -2282,26 +2158,17 @@
           <w:rFonts w:asciiTheme="minorHAnsi" w:hAnsiTheme="minorHAnsi" w:cstheme="minorHAnsi"/>
         </w:rPr>
       </w:pPr>
-    </w:p>
-    <w:p>
-      <w:pPr>
-        <w:pStyle w:val="Heading3"/>
-        <w:jc w:val="both"/>
-        <w:rPr>
-          <w:rFonts w:asciiTheme="minorHAnsi" w:hAnsiTheme="minorHAnsi" w:cstheme="minorHAnsi"/>
-        </w:rPr>
-      </w:pPr>
       <w:r>
         <w:rPr>
           <w:rFonts w:asciiTheme="minorHAnsi" w:hAnsiTheme="minorHAnsi" w:cstheme="minorHAnsi"/>
         </w:rPr>
         <w:lastRenderedPageBreak/>
-        <w:t>Customer Lifetime Value</w:t>
-      </w:r>
-    </w:p>
-    <w:p>
-      <w:pPr>
-        <w:pStyle w:val="Heading3"/>
+        <w:t>Purchase Frequency</w:t>
+      </w:r>
+    </w:p>
+    <w:p>
+      <w:pPr>
+        <w:spacing w:after="160"/>
         <w:jc w:val="both"/>
         <w:rPr>
           <w:rFonts w:asciiTheme="minorHAnsi" w:hAnsiTheme="minorHAnsi" w:cstheme="minorHAnsi"/>
@@ -2313,10 +2180,10 @@
           <w:noProof/>
         </w:rPr>
         <w:drawing>
-          <wp:inline distT="0" distB="0" distL="0" distR="0" wp14:anchorId="4863BE01" wp14:editId="56511585">
-            <wp:extent cx="6038850" cy="1910069"/>
+          <wp:inline distT="0" distB="0" distL="0" distR="0" wp14:anchorId="07121F27" wp14:editId="5D41C1AE">
+            <wp:extent cx="5943600" cy="2009775"/>
             <wp:effectExtent l="0" t="0" r="0" b="0"/>
-            <wp:docPr id="6" name="Picture 6"/>
+            <wp:docPr id="5" name="Picture 5"/>
             <wp:cNvGraphicFramePr>
               <a:graphicFrameLocks xmlns:a="http://schemas.openxmlformats.org/drawingml/2006/main" noChangeAspect="1"/>
             </wp:cNvGraphicFramePr>
@@ -2339,7 +2206,7 @@
                   <pic:spPr bwMode="auto">
                     <a:xfrm>
                       <a:off x="0" y="0"/>
-                      <a:ext cx="6070400" cy="1920048"/>
+                      <a:ext cx="5943600" cy="2009775"/>
                     </a:xfrm>
                     <a:prstGeom prst="rect">
                       <a:avLst/>
@@ -2364,39 +2231,36 @@
         <w:rPr>
           <w:rFonts w:asciiTheme="minorHAnsi" w:hAnsiTheme="minorHAnsi" w:cstheme="minorHAnsi"/>
         </w:rPr>
-        <w:t>CLV is highly right-sk</w:t>
-      </w:r>
-      <w:r>
-        <w:rPr>
-          <w:rFonts w:asciiTheme="minorHAnsi" w:hAnsiTheme="minorHAnsi" w:cstheme="minorHAnsi"/>
-        </w:rPr>
-        <w:t>ewed. The median customer generated £370 in lifetime revenue, while the top 10% of customers generated £2,800 or more. The top 1% accounted for disproportionate revenue. This Pareto-like distribution underscores the critical importance of identifying, prot</w:t>
-      </w:r>
-      <w:r>
-        <w:rPr>
-          <w:rFonts w:asciiTheme="minorHAnsi" w:hAnsiTheme="minorHAnsi" w:cstheme="minorHAnsi"/>
-        </w:rPr>
-        <w:t>ecting, and growing the highest-value customer tier.</w:t>
-      </w:r>
-    </w:p>
-    <w:p>
-      <w:pPr>
-        <w:pStyle w:val="Heading2"/>
-        <w:jc w:val="both"/>
-        <w:rPr>
-          <w:rFonts w:asciiTheme="minorHAnsi" w:hAnsiTheme="minorHAnsi" w:cstheme="minorHAnsi"/>
-        </w:rPr>
-      </w:pPr>
-      <w:r>
-        <w:rPr>
-          <w:rFonts w:asciiTheme="minorHAnsi" w:hAnsiTheme="minorHAnsi" w:cstheme="minorHAnsi"/>
-        </w:rPr>
-        <w:t>3.4 Product Performance</w:t>
-      </w:r>
-    </w:p>
-    <w:p>
-      <w:pPr>
-        <w:spacing w:after="160"/>
+        <w:t>Approximately 35% of customers made only a single purchase. The median customer placed 2 orders, while the most active customer placed 209 orders. This frequency distribution highlights a significant opportunity in first-to-second purchase conversion — moving the modal customer from one-time to repeat buyer.</w:t>
+      </w:r>
+    </w:p>
+    <w:p>
+      <w:pPr>
+        <w:pStyle w:val="Heading3"/>
+        <w:jc w:val="both"/>
+        <w:rPr>
+          <w:rFonts w:asciiTheme="minorHAnsi" w:hAnsiTheme="minorHAnsi" w:cstheme="minorHAnsi"/>
+        </w:rPr>
+      </w:pPr>
+    </w:p>
+    <w:p>
+      <w:pPr>
+        <w:pStyle w:val="Heading3"/>
+        <w:jc w:val="both"/>
+        <w:rPr>
+          <w:rFonts w:asciiTheme="minorHAnsi" w:hAnsiTheme="minorHAnsi" w:cstheme="minorHAnsi"/>
+        </w:rPr>
+      </w:pPr>
+      <w:r>
+        <w:rPr>
+          <w:rFonts w:asciiTheme="minorHAnsi" w:hAnsiTheme="minorHAnsi" w:cstheme="minorHAnsi"/>
+        </w:rPr>
+        <w:t>Customer Lifetime Value</w:t>
+      </w:r>
+    </w:p>
+    <w:p>
+      <w:pPr>
+        <w:pStyle w:val="Heading3"/>
         <w:jc w:val="both"/>
         <w:rPr>
           <w:rFonts w:asciiTheme="minorHAnsi" w:hAnsiTheme="minorHAnsi" w:cstheme="minorHAnsi"/>
@@ -2408,10 +2272,10 @@
           <w:noProof/>
         </w:rPr>
         <w:drawing>
-          <wp:inline distT="0" distB="0" distL="0" distR="0" wp14:anchorId="6553F9BE" wp14:editId="61A0DB91">
-            <wp:extent cx="5943600" cy="2286000"/>
+          <wp:inline distT="0" distB="0" distL="0" distR="0" wp14:anchorId="4863BE01" wp14:editId="56511585">
+            <wp:extent cx="6038850" cy="1910069"/>
             <wp:effectExtent l="0" t="0" r="0" b="0"/>
-            <wp:docPr id="7" name="Picture 7"/>
+            <wp:docPr id="6" name="Picture 6"/>
             <wp:cNvGraphicFramePr>
               <a:graphicFrameLocks xmlns:a="http://schemas.openxmlformats.org/drawingml/2006/main" noChangeAspect="1"/>
             </wp:cNvGraphicFramePr>
@@ -2434,7 +2298,7 @@
                   <pic:spPr bwMode="auto">
                     <a:xfrm>
                       <a:off x="0" y="0"/>
-                      <a:ext cx="5943600" cy="2286000"/>
+                      <a:ext cx="6070400" cy="1920048"/>
                     </a:xfrm>
                     <a:prstGeom prst="rect">
                       <a:avLst/>
@@ -2459,21 +2323,59 @@
         <w:rPr>
           <w:rFonts w:asciiTheme="minorHAnsi" w:hAnsiTheme="minorHAnsi" w:cstheme="minorHAnsi"/>
         </w:rPr>
-        <w:t xml:space="preserve">The top 10 products by revenue are concentrated in the decorative homewares and seasonal gifting categories. These products exhibit strong cross-selling potential and should be </w:t>
-      </w:r>
-      <w:proofErr w:type="spellStart"/>
-      <w:r>
-        <w:rPr>
-          <w:rFonts w:asciiTheme="minorHAnsi" w:hAnsiTheme="minorHAnsi" w:cstheme="minorHAnsi"/>
-        </w:rPr>
-        <w:t>prioritised</w:t>
-      </w:r>
-      <w:proofErr w:type="spellEnd"/>
-      <w:r>
-        <w:rPr>
-          <w:rFonts w:asciiTheme="minorHAnsi" w:hAnsiTheme="minorHAnsi" w:cstheme="minorHAnsi"/>
-        </w:rPr>
-        <w:t xml:space="preserve"> in promotional campaigns, search rankings, and inventory planning.</w:t>
+        <w:t>CLV is highly right-skewed. The median customer generated £370 in lifetime revenue, while the top 10% of customers generated £2,800 or more. The top 1% accounted for disproportionate revenue. This Pareto-like distribution underscores the critical importance of identifying, protecting, and growing the highest-value customer tier.</w:t>
+      </w:r>
+    </w:p>
+    <w:p>
+      <w:pPr>
+        <w:pStyle w:val="Heading2"/>
+        <w:jc w:val="both"/>
+        <w:rPr>
+          <w:rFonts w:asciiTheme="minorHAnsi" w:hAnsiTheme="minorHAnsi" w:cstheme="minorHAnsi"/>
+        </w:rPr>
+      </w:pPr>
+    </w:p>
+    <w:p>
+      <w:pPr>
+        <w:pStyle w:val="Heading2"/>
+        <w:jc w:val="both"/>
+        <w:rPr>
+          <w:rFonts w:asciiTheme="minorHAnsi" w:hAnsiTheme="minorHAnsi" w:cstheme="minorHAnsi"/>
+        </w:rPr>
+      </w:pPr>
+    </w:p>
+    <w:p>
+      <w:pPr>
+        <w:pStyle w:val="Heading2"/>
+        <w:jc w:val="both"/>
+        <w:rPr>
+          <w:rFonts w:asciiTheme="minorHAnsi" w:hAnsiTheme="minorHAnsi" w:cstheme="minorHAnsi"/>
+        </w:rPr>
+      </w:pPr>
+    </w:p>
+    <w:p>
+      <w:pPr>
+        <w:pStyle w:val="Heading2"/>
+        <w:jc w:val="both"/>
+        <w:rPr>
+          <w:rFonts w:asciiTheme="minorHAnsi" w:hAnsiTheme="minorHAnsi" w:cstheme="minorHAnsi"/>
+        </w:rPr>
+      </w:pPr>
+    </w:p>
+    <w:p>
+      <w:pPr>
+        <w:pStyle w:val="Heading2"/>
+        <w:jc w:val="both"/>
+        <w:rPr>
+          <w:rFonts w:asciiTheme="minorHAnsi" w:hAnsiTheme="minorHAnsi" w:cstheme="minorHAnsi"/>
+        </w:rPr>
+      </w:pPr>
+      <w:r>
+        <w:rPr>
+          <w:rFonts w:asciiTheme="minorHAnsi" w:hAnsiTheme="minorHAnsi" w:cstheme="minorHAnsi"/>
+        </w:rPr>
+        <w:lastRenderedPageBreak/>
+        <w:t>3.4 Product Performance</w:t>
       </w:r>
     </w:p>
     <w:p>
@@ -2489,12 +2391,11 @@
           <w:rFonts w:asciiTheme="minorHAnsi" w:hAnsiTheme="minorHAnsi" w:cstheme="minorHAnsi"/>
           <w:noProof/>
         </w:rPr>
-        <w:lastRenderedPageBreak/>
         <w:drawing>
-          <wp:inline distT="0" distB="0" distL="0" distR="0" wp14:anchorId="731438F1" wp14:editId="69D96BA3">
-            <wp:extent cx="5943600" cy="2009775"/>
+          <wp:inline distT="0" distB="0" distL="0" distR="0" wp14:anchorId="6553F9BE" wp14:editId="61A0DB91">
+            <wp:extent cx="5943600" cy="2286000"/>
             <wp:effectExtent l="0" t="0" r="0" b="0"/>
-            <wp:docPr id="8" name="Picture 8"/>
+            <wp:docPr id="7" name="Picture 7"/>
             <wp:cNvGraphicFramePr>
               <a:graphicFrameLocks xmlns:a="http://schemas.openxmlformats.org/drawingml/2006/main" noChangeAspect="1"/>
             </wp:cNvGraphicFramePr>
@@ -2517,7 +2418,7 @@
                   <pic:spPr bwMode="auto">
                     <a:xfrm>
                       <a:off x="0" y="0"/>
-                      <a:ext cx="5943600" cy="2009775"/>
+                      <a:ext cx="5943600" cy="2286000"/>
                     </a:xfrm>
                     <a:prstGeom prst="rect">
                       <a:avLst/>
@@ -2542,40 +2443,21 @@
         <w:rPr>
           <w:rFonts w:asciiTheme="minorHAnsi" w:hAnsiTheme="minorHAnsi" w:cstheme="minorHAnsi"/>
         </w:rPr>
-        <w:t xml:space="preserve">A set of products shows very low average revenue per transaction despite meaningful order frequency. These items may be priced too low, sold in insufficient quantities, or bundled poorly. They represent a pricing and merchandising </w:t>
-      </w:r>
-      <w:r>
-        <w:rPr>
-          <w:rFonts w:asciiTheme="minorHAnsi" w:hAnsiTheme="minorHAnsi" w:cstheme="minorHAnsi"/>
-        </w:rPr>
-        <w:t>optimization</w:t>
-      </w:r>
-      <w:r>
-        <w:rPr>
-          <w:rFonts w:asciiTheme="minorHAnsi" w:hAnsiTheme="minorHAnsi" w:cstheme="minorHAnsi"/>
-        </w:rPr>
-        <w:t xml:space="preserve"> opportuni</w:t>
-      </w:r>
-      <w:r>
-        <w:rPr>
-          <w:rFonts w:asciiTheme="minorHAnsi" w:hAnsiTheme="minorHAnsi" w:cstheme="minorHAnsi"/>
-        </w:rPr>
-        <w:t>ty.</w:t>
-      </w:r>
-    </w:p>
-    <w:p>
-      <w:pPr>
-        <w:pStyle w:val="Heading2"/>
-        <w:jc w:val="both"/>
-        <w:rPr>
-          <w:rFonts w:asciiTheme="minorHAnsi" w:hAnsiTheme="minorHAnsi" w:cstheme="minorHAnsi"/>
-        </w:rPr>
-      </w:pPr>
-      <w:r>
-        <w:rPr>
-          <w:rFonts w:asciiTheme="minorHAnsi" w:hAnsiTheme="minorHAnsi" w:cstheme="minorHAnsi"/>
-        </w:rPr>
-        <w:t>3.5 Cohort Retention Analysis</w:t>
+        <w:t xml:space="preserve">The top 10 products by revenue are concentrated in the decorative homewares and seasonal gifting categories. These products exhibit strong cross-selling potential and should be </w:t>
+      </w:r>
+      <w:proofErr w:type="spellStart"/>
+      <w:r>
+        <w:rPr>
+          <w:rFonts w:asciiTheme="minorHAnsi" w:hAnsiTheme="minorHAnsi" w:cstheme="minorHAnsi"/>
+        </w:rPr>
+        <w:t>prioritised</w:t>
+      </w:r>
+      <w:proofErr w:type="spellEnd"/>
+      <w:r>
+        <w:rPr>
+          <w:rFonts w:asciiTheme="minorHAnsi" w:hAnsiTheme="minorHAnsi" w:cstheme="minorHAnsi"/>
+        </w:rPr>
+        <w:t xml:space="preserve"> in promotional campaigns, search rankings, and inventory planning.</w:t>
       </w:r>
     </w:p>
     <w:p>
@@ -2592,10 +2474,10 @@
           <w:noProof/>
         </w:rPr>
         <w:drawing>
-          <wp:inline distT="0" distB="0" distL="0" distR="0" wp14:anchorId="5503303E" wp14:editId="765EA72B">
-            <wp:extent cx="5943600" cy="2924175"/>
+          <wp:inline distT="0" distB="0" distL="0" distR="0" wp14:anchorId="731438F1" wp14:editId="69D96BA3">
+            <wp:extent cx="5943600" cy="2009775"/>
             <wp:effectExtent l="0" t="0" r="0" b="0"/>
-            <wp:docPr id="9" name="Picture 9"/>
+            <wp:docPr id="8" name="Picture 8"/>
             <wp:cNvGraphicFramePr>
               <a:graphicFrameLocks xmlns:a="http://schemas.openxmlformats.org/drawingml/2006/main" noChangeAspect="1"/>
             </wp:cNvGraphicFramePr>
@@ -2618,7 +2500,7 @@
                   <pic:spPr bwMode="auto">
                     <a:xfrm>
                       <a:off x="0" y="0"/>
-                      <a:ext cx="5943600" cy="2924175"/>
+                      <a:ext cx="5943600" cy="2009775"/>
                     </a:xfrm>
                     <a:prstGeom prst="rect">
                       <a:avLst/>
@@ -2643,13 +2525,19 @@
         <w:rPr>
           <w:rFonts w:asciiTheme="minorHAnsi" w:hAnsiTheme="minorHAnsi" w:cstheme="minorHAnsi"/>
         </w:rPr>
-        <w:t xml:space="preserve">Cohort retention analysis reveals that the first month post-acquisition is the most critical retention window. Average month-1 retention is approximately 20–25%, declining steeply thereafter. The December 2010 cohort — </w:t>
-      </w:r>
-      <w:r>
-        <w:rPr>
-          <w:rFonts w:asciiTheme="minorHAnsi" w:hAnsiTheme="minorHAnsi" w:cstheme="minorHAnsi"/>
-        </w:rPr>
-        <w:t>likely composed of holiday shoppers — shows relatively stronger long-term retention, suggesting that seasonal buyers, once retained, may be more loyal than average.</w:t>
+        <w:t xml:space="preserve">A set of products shows very low average revenue per transaction despite meaningful order frequency. These items may be priced too low, sold in insufficient quantities, or bundled poorly. They represent a pricing and merchandising </w:t>
+      </w:r>
+      <w:r>
+        <w:rPr>
+          <w:rFonts w:asciiTheme="minorHAnsi" w:hAnsiTheme="minorHAnsi" w:cstheme="minorHAnsi"/>
+        </w:rPr>
+        <w:t>optimization</w:t>
+      </w:r>
+      <w:r>
+        <w:rPr>
+          <w:rFonts w:asciiTheme="minorHAnsi" w:hAnsiTheme="minorHAnsi" w:cstheme="minorHAnsi"/>
+        </w:rPr>
+        <w:t xml:space="preserve"> opportunity.</w:t>
       </w:r>
     </w:p>
     <w:p>
@@ -2658,8 +2546,6 @@
         <w:jc w:val="both"/>
         <w:rPr>
           <w:rFonts w:asciiTheme="minorHAnsi" w:hAnsiTheme="minorHAnsi" w:cstheme="minorHAnsi"/>
-          <w:sz w:val="24"/>
-          <w:szCs w:val="24"/>
         </w:rPr>
       </w:pPr>
     </w:p>
@@ -2669,8 +2555,6 @@
         <w:jc w:val="both"/>
         <w:rPr>
           <w:rFonts w:asciiTheme="minorHAnsi" w:hAnsiTheme="minorHAnsi" w:cstheme="minorHAnsi"/>
-          <w:sz w:val="24"/>
-          <w:szCs w:val="24"/>
         </w:rPr>
       </w:pPr>
     </w:p>
@@ -2680,8 +2564,6 @@
         <w:jc w:val="both"/>
         <w:rPr>
           <w:rFonts w:asciiTheme="minorHAnsi" w:hAnsiTheme="minorHAnsi" w:cstheme="minorHAnsi"/>
-          <w:sz w:val="24"/>
-          <w:szCs w:val="24"/>
         </w:rPr>
       </w:pPr>
     </w:p>
@@ -2691,18 +2573,32 @@
         <w:jc w:val="both"/>
         <w:rPr>
           <w:rFonts w:asciiTheme="minorHAnsi" w:hAnsiTheme="minorHAnsi" w:cstheme="minorHAnsi"/>
-          <w:sz w:val="24"/>
-          <w:szCs w:val="24"/>
-        </w:rPr>
-      </w:pPr>
-      <w:r>
-        <w:rPr>
-          <w:rFonts w:asciiTheme="minorHAnsi" w:hAnsiTheme="minorHAnsi" w:cstheme="minorHAnsi"/>
-          <w:sz w:val="24"/>
-          <w:szCs w:val="24"/>
+        </w:rPr>
+      </w:pPr>
+    </w:p>
+    <w:p>
+      <w:pPr>
+        <w:pStyle w:val="Heading2"/>
+        <w:jc w:val="both"/>
+        <w:rPr>
+          <w:rFonts w:asciiTheme="minorHAnsi" w:hAnsiTheme="minorHAnsi" w:cstheme="minorHAnsi"/>
+        </w:rPr>
+      </w:pPr>
+    </w:p>
+    <w:p>
+      <w:pPr>
+        <w:pStyle w:val="Heading2"/>
+        <w:jc w:val="both"/>
+        <w:rPr>
+          <w:rFonts w:asciiTheme="minorHAnsi" w:hAnsiTheme="minorHAnsi" w:cstheme="minorHAnsi"/>
+        </w:rPr>
+      </w:pPr>
+      <w:r>
+        <w:rPr>
+          <w:rFonts w:asciiTheme="minorHAnsi" w:hAnsiTheme="minorHAnsi" w:cstheme="minorHAnsi"/>
         </w:rPr>
         <w:lastRenderedPageBreak/>
-        <w:t>3.6 RFM Segmentation</w:t>
+        <w:t>3.5 Cohort Retention Analysis</w:t>
       </w:r>
     </w:p>
     <w:p>
@@ -2719,10 +2615,10 @@
           <w:noProof/>
         </w:rPr>
         <w:drawing>
-          <wp:inline distT="0" distB="0" distL="0" distR="0" wp14:anchorId="284004FF" wp14:editId="3B0C8586">
-            <wp:extent cx="5943600" cy="2381250"/>
+          <wp:inline distT="0" distB="0" distL="0" distR="0" wp14:anchorId="5503303E" wp14:editId="765EA72B">
+            <wp:extent cx="5943600" cy="2924175"/>
             <wp:effectExtent l="0" t="0" r="0" b="0"/>
-            <wp:docPr id="10" name="Picture 10"/>
+            <wp:docPr id="9" name="Picture 9"/>
             <wp:cNvGraphicFramePr>
               <a:graphicFrameLocks xmlns:a="http://schemas.openxmlformats.org/drawingml/2006/main" noChangeAspect="1"/>
             </wp:cNvGraphicFramePr>
@@ -2745,6 +2641,104 @@
                   <pic:spPr bwMode="auto">
                     <a:xfrm>
                       <a:off x="0" y="0"/>
+                      <a:ext cx="5943600" cy="2924175"/>
+                    </a:xfrm>
+                    <a:prstGeom prst="rect">
+                      <a:avLst/>
+                    </a:prstGeom>
+                  </pic:spPr>
+                </pic:pic>
+              </a:graphicData>
+            </a:graphic>
+          </wp:inline>
+        </w:drawing>
+      </w:r>
+    </w:p>
+    <w:p>
+      <w:pPr>
+        <w:spacing w:after="160"/>
+        <w:jc w:val="both"/>
+        <w:rPr>
+          <w:rFonts w:asciiTheme="minorHAnsi" w:hAnsiTheme="minorHAnsi" w:cstheme="minorHAnsi"/>
+        </w:rPr>
+      </w:pPr>
+      <w:r>
+        <w:rPr>
+          <w:rFonts w:asciiTheme="minorHAnsi" w:hAnsiTheme="minorHAnsi" w:cstheme="minorHAnsi"/>
+        </w:rPr>
+        <w:t>Cohort retention analysis reveals that the first month post-acquisition is the most critical retention window. Average month-1 retention is approximately 20–25%, declining steeply thereafter. The December 2010 cohort — likely composed of holiday shoppers — shows relatively stronger long-term retention, suggesting that seasonal buyers, once retained, may be more loyal than average.</w:t>
+      </w:r>
+    </w:p>
+    <w:p>
+      <w:pPr>
+        <w:pStyle w:val="Heading2"/>
+        <w:jc w:val="both"/>
+        <w:rPr>
+          <w:rFonts w:asciiTheme="minorHAnsi" w:hAnsiTheme="minorHAnsi" w:cstheme="minorHAnsi"/>
+          <w:sz w:val="24"/>
+          <w:szCs w:val="24"/>
+        </w:rPr>
+      </w:pPr>
+    </w:p>
+    <w:p>
+      <w:pPr>
+        <w:pStyle w:val="Heading2"/>
+        <w:jc w:val="both"/>
+        <w:rPr>
+          <w:rFonts w:asciiTheme="minorHAnsi" w:hAnsiTheme="minorHAnsi" w:cstheme="minorHAnsi"/>
+          <w:sz w:val="24"/>
+          <w:szCs w:val="24"/>
+        </w:rPr>
+      </w:pPr>
+      <w:r>
+        <w:rPr>
+          <w:rFonts w:asciiTheme="minorHAnsi" w:hAnsiTheme="minorHAnsi" w:cstheme="minorHAnsi"/>
+          <w:sz w:val="24"/>
+          <w:szCs w:val="24"/>
+        </w:rPr>
+        <w:t>3.6 RFM Segmentation</w:t>
+      </w:r>
+    </w:p>
+    <w:p>
+      <w:pPr>
+        <w:spacing w:after="160"/>
+        <w:jc w:val="both"/>
+        <w:rPr>
+          <w:rFonts w:asciiTheme="minorHAnsi" w:hAnsiTheme="minorHAnsi" w:cstheme="minorHAnsi"/>
+        </w:rPr>
+      </w:pPr>
+      <w:r>
+        <w:rPr>
+          <w:rFonts w:asciiTheme="minorHAnsi" w:hAnsiTheme="minorHAnsi" w:cstheme="minorHAnsi"/>
+          <w:noProof/>
+        </w:rPr>
+        <w:drawing>
+          <wp:inline distT="0" distB="0" distL="0" distR="0" wp14:anchorId="284004FF" wp14:editId="3B0C8586">
+            <wp:extent cx="5943600" cy="2381250"/>
+            <wp:effectExtent l="0" t="0" r="0" b="0"/>
+            <wp:docPr id="10" name="Picture 10"/>
+            <wp:cNvGraphicFramePr>
+              <a:graphicFrameLocks xmlns:a="http://schemas.openxmlformats.org/drawingml/2006/main" noChangeAspect="1"/>
+            </wp:cNvGraphicFramePr>
+            <a:graphic xmlns:a="http://schemas.openxmlformats.org/drawingml/2006/main">
+              <a:graphicData uri="http://schemas.openxmlformats.org/drawingml/2006/picture">
+                <pic:pic xmlns:pic="http://schemas.openxmlformats.org/drawingml/2006/picture">
+                  <pic:nvPicPr>
+                    <pic:cNvPr id="0" name=""/>
+                    <pic:cNvPicPr>
+                      <a:picLocks noChangeAspect="1" noChangeArrowheads="1"/>
+                    </pic:cNvPicPr>
+                  </pic:nvPicPr>
+                  <pic:blipFill>
+                    <a:blip r:embed="rId18"/>
+                    <a:srcRect/>
+                    <a:stretch>
+                      <a:fillRect/>
+                    </a:stretch>
+                  </pic:blipFill>
+                  <pic:spPr bwMode="auto">
+                    <a:xfrm>
+                      <a:off x="0" y="0"/>
                       <a:ext cx="5943600" cy="2381250"/>
                     </a:xfrm>
                     <a:prstGeom prst="rect">
@@ -2775,10 +2769,20 @@
           <w:rFonts w:asciiTheme="minorHAnsi" w:hAnsiTheme="minorHAnsi" w:cstheme="minorHAnsi"/>
         </w:rPr>
       </w:pPr>
-      <w:r>
-        <w:rPr>
-          <w:rFonts w:asciiTheme="minorHAnsi" w:hAnsiTheme="minorHAnsi" w:cstheme="minorHAnsi"/>
-        </w:rPr>
+    </w:p>
+    <w:p>
+      <w:pPr>
+        <w:spacing w:after="160"/>
+        <w:jc w:val="both"/>
+        <w:rPr>
+          <w:rFonts w:asciiTheme="minorHAnsi" w:hAnsiTheme="minorHAnsi" w:cstheme="minorHAnsi"/>
+        </w:rPr>
+      </w:pPr>
+      <w:r>
+        <w:rPr>
+          <w:rFonts w:asciiTheme="minorHAnsi" w:hAnsiTheme="minorHAnsi" w:cstheme="minorHAnsi"/>
+        </w:rPr>
+        <w:lastRenderedPageBreak/>
         <w:t>RFM analysis classified customers into five segments based on composite Recency, Frequency, and Monetary scores:</w:t>
       </w:r>
     </w:p>
@@ -2807,12 +2811,6 @@
         <w:gridCol w:w="1832"/>
       </w:tblGrid>
       <w:tr>
-        <w:tblPrEx>
-          <w:tblCellMar>
-            <w:top w:w="0" w:type="dxa"/>
-            <w:bottom w:w="0" w:type="dxa"/>
-          </w:tblCellMar>
-        </w:tblPrEx>
         <w:tc>
           <w:tcPr>
             <w:tcW w:w="1872" w:type="dxa"/>
@@ -3010,12 +3008,6 @@
         </w:tc>
       </w:tr>
       <w:tr>
-        <w:tblPrEx>
-          <w:tblCellMar>
-            <w:top w:w="0" w:type="dxa"/>
-            <w:bottom w:w="0" w:type="dxa"/>
-          </w:tblCellMar>
-        </w:tblPrEx>
         <w:tc>
           <w:tcPr>
             <w:tcW w:w="2200" w:type="dxa"/>
@@ -3174,18 +3166,20 @@
               <w:rPr>
                 <w:rFonts w:asciiTheme="minorHAnsi" w:hAnsiTheme="minorHAnsi" w:cstheme="minorHAnsi"/>
               </w:rPr>
-              <w:t>Protect &amp; grow – VIP programme</w:t>
-            </w:r>
+              <w:t xml:space="preserve">Protect &amp; grow – VIP </w:t>
+            </w:r>
+            <w:proofErr w:type="spellStart"/>
+            <w:r>
+              <w:rPr>
+                <w:rFonts w:asciiTheme="minorHAnsi" w:hAnsiTheme="minorHAnsi" w:cstheme="minorHAnsi"/>
+              </w:rPr>
+              <w:t>programme</w:t>
+            </w:r>
+            <w:proofErr w:type="spellEnd"/>
           </w:p>
         </w:tc>
       </w:tr>
       <w:tr>
-        <w:tblPrEx>
-          <w:tblCellMar>
-            <w:top w:w="0" w:type="dxa"/>
-            <w:bottom w:w="0" w:type="dxa"/>
-          </w:tblCellMar>
-        </w:tblPrEx>
         <w:tc>
           <w:tcPr>
             <w:tcW w:w="2200" w:type="dxa"/>
@@ -3350,12 +3344,6 @@
         </w:tc>
       </w:tr>
       <w:tr>
-        <w:tblPrEx>
-          <w:tblCellMar>
-            <w:top w:w="0" w:type="dxa"/>
-            <w:bottom w:w="0" w:type="dxa"/>
-          </w:tblCellMar>
-        </w:tblPrEx>
         <w:tc>
           <w:tcPr>
             <w:tcW w:w="2200" w:type="dxa"/>
@@ -3520,12 +3508,6 @@
         </w:tc>
       </w:tr>
       <w:tr>
-        <w:tblPrEx>
-          <w:tblCellMar>
-            <w:top w:w="0" w:type="dxa"/>
-            <w:bottom w:w="0" w:type="dxa"/>
-          </w:tblCellMar>
-        </w:tblPrEx>
         <w:tc>
           <w:tcPr>
             <w:tcW w:w="2200" w:type="dxa"/>
@@ -3690,12 +3672,6 @@
         </w:tc>
       </w:tr>
       <w:tr>
-        <w:tblPrEx>
-          <w:tblCellMar>
-            <w:top w:w="0" w:type="dxa"/>
-            <w:bottom w:w="0" w:type="dxa"/>
-          </w:tblCellMar>
-        </w:tblPrEx>
         <w:tc>
           <w:tcPr>
             <w:tcW w:w="2200" w:type="dxa"/>
@@ -3878,35 +3854,12 @@
           <w:szCs w:val="32"/>
         </w:rPr>
       </w:pPr>
-    </w:p>
-    <w:p>
-      <w:pPr>
-        <w:pStyle w:val="Heading1"/>
-        <w:jc w:val="both"/>
+      <w:r>
         <w:rPr>
           <w:rFonts w:asciiTheme="minorHAnsi" w:hAnsiTheme="minorHAnsi" w:cstheme="minorHAnsi"/>
           <w:sz w:val="32"/>
           <w:szCs w:val="32"/>
         </w:rPr>
-      </w:pPr>
-    </w:p>
-    <w:p>
-      <w:pPr>
-        <w:pStyle w:val="Heading1"/>
-        <w:jc w:val="both"/>
-        <w:rPr>
-          <w:rFonts w:asciiTheme="minorHAnsi" w:hAnsiTheme="minorHAnsi" w:cstheme="minorHAnsi"/>
-          <w:sz w:val="32"/>
-          <w:szCs w:val="32"/>
-        </w:rPr>
-      </w:pPr>
-      <w:r>
-        <w:rPr>
-          <w:rFonts w:asciiTheme="minorHAnsi" w:hAnsiTheme="minorHAnsi" w:cstheme="minorHAnsi"/>
-          <w:sz w:val="32"/>
-          <w:szCs w:val="32"/>
-        </w:rPr>
-        <w:lastRenderedPageBreak/>
         <w:t>4</w:t>
       </w:r>
       <w:r>
@@ -3993,13 +3946,21 @@
         <w:rPr>
           <w:rFonts w:asciiTheme="minorHAnsi" w:hAnsiTheme="minorHAnsi" w:cstheme="minorHAnsi"/>
         </w:rPr>
-        <w:t>Launch a tiered VIP loyalty programme with exclusive early</w:t>
-      </w:r>
-      <w:r>
-        <w:rPr>
-          <w:rFonts w:asciiTheme="minorHAnsi" w:hAnsiTheme="minorHAnsi" w:cstheme="minorHAnsi"/>
-        </w:rPr>
-        <w:t xml:space="preserve"> access, free delivery, and priority support.</w:t>
+        <w:t xml:space="preserve">Launch a tiered VIP loyalty </w:t>
+      </w:r>
+      <w:proofErr w:type="spellStart"/>
+      <w:r>
+        <w:rPr>
+          <w:rFonts w:asciiTheme="minorHAnsi" w:hAnsiTheme="minorHAnsi" w:cstheme="minorHAnsi"/>
+        </w:rPr>
+        <w:t>programme</w:t>
+      </w:r>
+      <w:proofErr w:type="spellEnd"/>
+      <w:r>
+        <w:rPr>
+          <w:rFonts w:asciiTheme="minorHAnsi" w:hAnsiTheme="minorHAnsi" w:cstheme="minorHAnsi"/>
+        </w:rPr>
+        <w:t xml:space="preserve"> with exclusive early access, free delivery, and priority support.</w:t>
       </w:r>
     </w:p>
     <w:p>
@@ -4123,13 +4084,7 @@
         <w:rPr>
           <w:rFonts w:asciiTheme="minorHAnsi" w:hAnsiTheme="minorHAnsi" w:cstheme="minorHAnsi"/>
         </w:rPr>
-        <w:t>Deploy a 3-step automated email</w:t>
-      </w:r>
-      <w:r>
-        <w:rPr>
-          <w:rFonts w:asciiTheme="minorHAnsi" w:hAnsiTheme="minorHAnsi" w:cstheme="minorHAnsi"/>
-        </w:rPr>
-        <w:t xml:space="preserve"> win-back sequence: 10% discount offer → product spotlight → final 'we miss you' nudge.</w:t>
+        <w:t>Deploy a 3-step automated email win-back sequence: 10% discount offer → product spotlight → final 'we miss you' nudge.</w:t>
       </w:r>
     </w:p>
     <w:p>
@@ -4219,13 +4174,8 @@
         <w:rPr>
           <w:rFonts w:asciiTheme="minorHAnsi" w:hAnsiTheme="minorHAnsi" w:cstheme="minorHAnsi"/>
         </w:rPr>
-        <w:t>Approximately 35% of customer</w:t>
-      </w:r>
-      <w:r>
-        <w:rPr>
-          <w:rFonts w:asciiTheme="minorHAnsi" w:hAnsiTheme="minorHAnsi" w:cstheme="minorHAnsi"/>
-        </w:rPr>
-        <w:t>s make only one purchase. Even converting 20% of these customers to repeat buyers would materially increase revenue.</w:t>
+        <w:lastRenderedPageBreak/>
+        <w:t>Approximately 35% of customers make only one purchase. Even converting 20% of these customers to repeat buyers would materially increase revenue.</w:t>
       </w:r>
     </w:p>
     <w:p>
@@ -4265,13 +4215,7 @@
         <w:rPr>
           <w:rFonts w:asciiTheme="minorHAnsi" w:hAnsiTheme="minorHAnsi" w:cstheme="minorHAnsi"/>
         </w:rPr>
-        <w:t>Offer a 10% discount on the second order for all first-ti</w:t>
-      </w:r>
-      <w:r>
-        <w:rPr>
-          <w:rFonts w:asciiTheme="minorHAnsi" w:hAnsiTheme="minorHAnsi" w:cstheme="minorHAnsi"/>
-        </w:rPr>
-        <w:t>me buyers.</w:t>
+        <w:t>Offer a 10% discount on the second order for all first-time buyers.</w:t>
       </w:r>
     </w:p>
     <w:p>
@@ -4377,13 +4321,7 @@
         <w:rPr>
           <w:rFonts w:asciiTheme="minorHAnsi" w:hAnsiTheme="minorHAnsi" w:cstheme="minorHAnsi"/>
         </w:rPr>
-        <w:t>Pre-stock t</w:t>
-      </w:r>
-      <w:r>
-        <w:rPr>
-          <w:rFonts w:asciiTheme="minorHAnsi" w:hAnsiTheme="minorHAnsi" w:cstheme="minorHAnsi"/>
-        </w:rPr>
-        <w:t>op 10 SKUs by September with 2× normal inventory levels.</w:t>
+        <w:t>Pre-stock top 10 SKUs by September with 2× normal inventory levels.</w:t>
       </w:r>
     </w:p>
     <w:p>
@@ -4458,15 +4396,7 @@
           <w:sz w:val="24"/>
           <w:szCs w:val="24"/>
         </w:rPr>
-        <w:t xml:space="preserve"> Expan</w:t>
-      </w:r>
-      <w:r>
-        <w:rPr>
-          <w:rFonts w:asciiTheme="minorHAnsi" w:hAnsiTheme="minorHAnsi" w:cstheme="minorHAnsi"/>
-          <w:sz w:val="24"/>
-          <w:szCs w:val="24"/>
-        </w:rPr>
-        <w:t>d Internationally</w:t>
+        <w:t xml:space="preserve"> Expand Internationally</w:t>
       </w:r>
     </w:p>
     <w:p>
@@ -4533,13 +4463,7 @@
         <w:rPr>
           <w:rFonts w:asciiTheme="minorHAnsi" w:hAnsiTheme="minorHAnsi" w:cstheme="minorHAnsi"/>
         </w:rPr>
-        <w:t>Evaluate EU fulfilment partnerships to reduce cros</w:t>
-      </w:r>
-      <w:r>
-        <w:rPr>
-          <w:rFonts w:asciiTheme="minorHAnsi" w:hAnsiTheme="minorHAnsi" w:cstheme="minorHAnsi"/>
-        </w:rPr>
-        <w:t>s-border shipping costs and delivery times.</w:t>
+        <w:t>Evaluate EU fulfilment partnerships to reduce cross-border shipping costs and delivery times.</w:t>
       </w:r>
     </w:p>
     <w:p>
@@ -4578,7 +4502,6 @@
           <w:sz w:val="24"/>
           <w:szCs w:val="24"/>
         </w:rPr>
-        <w:lastRenderedPageBreak/>
         <w:t>6</w:t>
       </w:r>
       <w:r>
@@ -4646,13 +4569,7 @@
         <w:rPr>
           <w:rFonts w:asciiTheme="minorHAnsi" w:hAnsiTheme="minorHAnsi" w:cstheme="minorHAnsi"/>
         </w:rPr>
-        <w:t>Schedule promotional em</w:t>
-      </w:r>
-      <w:r>
-        <w:rPr>
-          <w:rFonts w:asciiTheme="minorHAnsi" w:hAnsiTheme="minorHAnsi" w:cstheme="minorHAnsi"/>
-        </w:rPr>
-        <w:t>ails and paid digital campaigns on Tuesdays and Thursdays.</w:t>
+        <w:t>Schedule promotional emails and paid digital campaigns on Tuesdays and Thursdays.</w:t>
       </w:r>
     </w:p>
     <w:p>
@@ -4706,13 +4623,7 @@
         <w:rPr>
           <w:rFonts w:asciiTheme="minorHAnsi" w:hAnsiTheme="minorHAnsi" w:cstheme="minorHAnsi"/>
         </w:rPr>
-        <w:t>This analysis demonstrates that the business is fundamentally healthy — growing, multi-market, and with a clear cohort of highly loyal, high-value customers. However, structural risks require strategic attention: geographic concentration, low first-month r</w:t>
-      </w:r>
-      <w:r>
-        <w:rPr>
-          <w:rFonts w:asciiTheme="minorHAnsi" w:hAnsiTheme="minorHAnsi" w:cstheme="minorHAnsi"/>
-        </w:rPr>
-        <w:t>etention, and over-reliance on a narrow seasonal window.</w:t>
+        <w:t>This analysis demonstrates that the business is fundamentally healthy — growing, multi-market, and with a clear cohort of highly loyal, high-value customers. However, structural risks require strategic attention: geographic concentration, low first-month retention, and over-reliance on a narrow seasonal window.</w:t>
       </w:r>
     </w:p>
     <w:p>
@@ -4739,17 +4650,25 @@
         <w:rPr>
           <w:rFonts w:asciiTheme="minorHAnsi" w:hAnsiTheme="minorHAnsi" w:cstheme="minorHAnsi"/>
         </w:rPr>
-        <w:t xml:space="preserve"> — offer a credible path to 20–30% revenue growth while reducing key-customer and geographic concentration risk. Priority actions are (1) VIP</w:t>
-      </w:r>
-      <w:r>
-        <w:rPr>
-          <w:rFonts w:asciiTheme="minorHAnsi" w:hAnsiTheme="minorHAnsi" w:cstheme="minorHAnsi"/>
-        </w:rPr>
-        <w:t xml:space="preserve"> programme for Champions and (2) an automated post-purchase nurture flow for new customers, as these deliver the highest expected return for lowest implementation cost.</w:t>
+        <w:t xml:space="preserve"> — offer a credible path to 20–30% revenue growth while reducing key-customer and geographic concentration risk. Priority actions are (1) VIP </w:t>
+      </w:r>
+      <w:proofErr w:type="spellStart"/>
+      <w:r>
+        <w:rPr>
+          <w:rFonts w:asciiTheme="minorHAnsi" w:hAnsiTheme="minorHAnsi" w:cstheme="minorHAnsi"/>
+        </w:rPr>
+        <w:t>programme</w:t>
+      </w:r>
+      <w:proofErr w:type="spellEnd"/>
+      <w:r>
+        <w:rPr>
+          <w:rFonts w:asciiTheme="minorHAnsi" w:hAnsiTheme="minorHAnsi" w:cstheme="minorHAnsi"/>
+        </w:rPr>
+        <w:t xml:space="preserve"> for Champions and (2) an automated post-purchase nurture flow for new customers, as these deliver the highest expected return for lowest implementation cost.</w:t>
       </w:r>
     </w:p>
     <w:sectPr>
-      <w:headerReference w:type="default" r:id="rId18"/>
+      <w:headerReference w:type="default" r:id="rId19"/>
       <w:pgSz w:w="12240" w:h="15840"/>
       <w:pgMar w:top="1440" w:right="1080" w:bottom="1440" w:left="1080" w:header="708" w:footer="708" w:gutter="0"/>
       <w:cols w:space="720"/>

</xml_diff>